<commit_message>
se agrego word informe peaton fallecido docx
</commit_message>
<xml_diff>
--- a/plantillas/word_informe_peaton_fallecido_marcadores.docx
+++ b/plantillas/word_informe_peaton_fallecido_marcadores.docx
@@ -3114,11 +3114,9 @@
       <w:pPr>
         <w:pStyle w:val="Heading3"/>
       </w:pPr>
-      <w:bookmarkStart w:id="8" w:name="_Toc8"/>
-      <w:r>
-        <w:t>Epicrisis</w:t>
-      </w:r>
-      <w:bookmarkEnd w:id="8"/>
+      <w:r>
+        <w:t>Dosaje etilico</w:t>
+      </w:r>
     </w:p>
     <w:tbl>
       <w:tblGrid>
@@ -3174,107 +3172,455 @@
             <w:pPr/>
             <w:r>
               <w:rPr/>
-              <w:t xml:space="preserve">${PREFIX_occ_nosocomio_epicrisis}</w:t>
-            </w:r>
-          </w:p>
-        </w:tc>
-        <w:tc>
-          <w:tcPr>
-            <w:tcW w:w="6500" w:type="dxa"/>
-            <w:noWrap/>
-          </w:tcPr>
-          <w:p>
-            <w:pPr/>
-            <w:r>
-              <w:rPr/>
-              <w:t xml:space="preserve">Epicrisis: nosocomio.</w:t>
-            </w:r>
-          </w:p>
-        </w:tc>
-      </w:tr>
-      <w:tr>
-        <w:trPr/>
-        <w:tc>
-          <w:tcPr>
-            <w:tcW w:w="4500" w:type="dxa"/>
-            <w:noWrap/>
-          </w:tcPr>
-          <w:p>
-            <w:pPr/>
-            <w:r>
-              <w:rPr/>
-              <w:t xml:space="preserve">${PREFIX_occ_numero_historia_epicrisis}</w:t>
-            </w:r>
-          </w:p>
-        </w:tc>
-        <w:tc>
-          <w:tcPr>
-            <w:tcW w:w="6500" w:type="dxa"/>
-            <w:noWrap/>
-          </w:tcPr>
-          <w:p>
-            <w:pPr/>
-            <w:r>
-              <w:rPr/>
-              <w:t xml:space="preserve">Epicrisis: numero de historia.</w:t>
-            </w:r>
-          </w:p>
-        </w:tc>
-      </w:tr>
-      <w:tr>
-        <w:trPr/>
-        <w:tc>
-          <w:tcPr>
-            <w:tcW w:w="4500" w:type="dxa"/>
-            <w:noWrap/>
-          </w:tcPr>
-          <w:p>
-            <w:pPr/>
-            <w:r>
-              <w:rPr/>
-              <w:t xml:space="preserve">${PREFIX_occ_tratamiento_epicrisis}</w:t>
-            </w:r>
-          </w:p>
-        </w:tc>
-        <w:tc>
-          <w:tcPr>
-            <w:tcW w:w="6500" w:type="dxa"/>
-            <w:noWrap/>
-          </w:tcPr>
-          <w:p>
-            <w:pPr/>
-            <w:r>
-              <w:rPr/>
-              <w:t xml:space="preserve">Epicrisis: tratamiento.</w:t>
-            </w:r>
-          </w:p>
-        </w:tc>
-      </w:tr>
-      <w:tr>
-        <w:trPr/>
-        <w:tc>
-          <w:tcPr>
-            <w:tcW w:w="4500" w:type="dxa"/>
-            <w:noWrap/>
-          </w:tcPr>
-          <w:p>
-            <w:pPr/>
-            <w:r>
-              <w:rPr/>
-              <w:t xml:space="preserve">${PREFIX_occ_hora_alta_epicrisis}</w:t>
-            </w:r>
-          </w:p>
-        </w:tc>
-        <w:tc>
-          <w:tcPr>
-            <w:tcW w:w="6500" w:type="dxa"/>
-            <w:noWrap/>
-          </w:tcPr>
-          <w:p>
-            <w:pPr/>
-            <w:r>
-              <w:rPr/>
-              <w:t xml:space="preserve">Epicrisis: hora de alta.</w:t>
+              <w:t xml:space="preserve">${PREFIX_fall_dosaje_numero}</w:t>
+            </w:r>
+          </w:p>
+        </w:tc>
+        <w:tc>
+          <w:tcPr>
+            <w:tcW w:w="6500" w:type="dxa"/>
+            <w:noWrap/>
+          </w:tcPr>
+          <w:p>
+            <w:pPr/>
+            <w:r>
+              <w:rPr/>
+              <w:t xml:space="preserve">Dosaje etilico: numero del documento.</w:t>
+            </w:r>
+          </w:p>
+        </w:tc>
+      </w:tr>
+      <w:tr>
+        <w:trPr/>
+        <w:tc>
+          <w:tcPr>
+            <w:tcW w:w="4500" w:type="dxa"/>
+            <w:noWrap/>
+          </w:tcPr>
+          <w:p>
+            <w:pPr/>
+            <w:r>
+              <w:rPr/>
+              <w:t xml:space="preserve">${PREFIX_fall_dosaje_registro}</w:t>
+            </w:r>
+          </w:p>
+        </w:tc>
+        <w:tc>
+          <w:tcPr>
+            <w:tcW w:w="6500" w:type="dxa"/>
+            <w:noWrap/>
+          </w:tcPr>
+          <w:p>
+            <w:pPr/>
+            <w:r>
+              <w:rPr/>
+              <w:t xml:space="preserve">Dosaje etilico: numero de registro.</w:t>
+            </w:r>
+          </w:p>
+        </w:tc>
+      </w:tr>
+      <w:tr>
+        <w:trPr/>
+        <w:tc>
+          <w:tcPr>
+            <w:tcW w:w="4500" w:type="dxa"/>
+            <w:noWrap/>
+          </w:tcPr>
+          <w:p>
+            <w:pPr/>
+            <w:r>
+              <w:rPr/>
+              <w:t xml:space="preserve">${PREFIX_fall_dosaje_fecha}</w:t>
+            </w:r>
+          </w:p>
+        </w:tc>
+        <w:tc>
+          <w:tcPr>
+            <w:tcW w:w="6500" w:type="dxa"/>
+            <w:noWrap/>
+          </w:tcPr>
+          <w:p>
+            <w:pPr/>
+            <w:r>
+              <w:rPr/>
+              <w:t xml:space="preserve">Dosaje etilico: fecha de extraccion.</w:t>
+            </w:r>
+          </w:p>
+        </w:tc>
+      </w:tr>
+      <w:tr>
+        <w:trPr/>
+        <w:tc>
+          <w:tcPr>
+            <w:tcW w:w="4500" w:type="dxa"/>
+            <w:noWrap/>
+          </w:tcPr>
+          <w:p>
+            <w:pPr/>
+            <w:r>
+              <w:rPr/>
+              <w:t xml:space="preserve">${PREFIX_fall_dosaje_hora}</w:t>
+            </w:r>
+          </w:p>
+        </w:tc>
+        <w:tc>
+          <w:tcPr>
+            <w:tcW w:w="6500" w:type="dxa"/>
+            <w:noWrap/>
+          </w:tcPr>
+          <w:p>
+            <w:pPr/>
+            <w:r>
+              <w:rPr/>
+              <w:t xml:space="preserve">Dosaje etilico: hora de extraccion.</w:t>
+            </w:r>
+          </w:p>
+        </w:tc>
+      </w:tr>
+      <w:tr>
+        <w:trPr/>
+        <w:tc>
+          <w:tcPr>
+            <w:tcW w:w="4500" w:type="dxa"/>
+            <w:noWrap/>
+          </w:tcPr>
+          <w:p>
+            <w:pPr/>
+            <w:r>
+              <w:rPr/>
+              <w:t xml:space="preserve">${PREFIX_fall_dosaje_resultado_cual}</w:t>
+            </w:r>
+          </w:p>
+        </w:tc>
+        <w:tc>
+          <w:tcPr>
+            <w:tcW w:w="6500" w:type="dxa"/>
+            <w:noWrap/>
+          </w:tcPr>
+          <w:p>
+            <w:pPr/>
+            <w:r>
+              <w:rPr/>
+              <w:t xml:space="preserve">Dosaje etilico: resultado cualitativo.</w:t>
+            </w:r>
+          </w:p>
+        </w:tc>
+      </w:tr>
+      <w:tr>
+        <w:trPr/>
+        <w:tc>
+          <w:tcPr>
+            <w:tcW w:w="4500" w:type="dxa"/>
+            <w:noWrap/>
+          </w:tcPr>
+          <w:p>
+            <w:pPr/>
+            <w:r>
+              <w:rPr/>
+              <w:t xml:space="preserve">${PREFIX_fall_dosaje_resultado_cuant}</w:t>
+            </w:r>
+          </w:p>
+        </w:tc>
+        <w:tc>
+          <w:tcPr>
+            <w:tcW w:w="6500" w:type="dxa"/>
+            <w:noWrap/>
+          </w:tcPr>
+          <w:p>
+            <w:pPr/>
+            <w:r>
+              <w:rPr/>
+              <w:t xml:space="preserve">Dosaje etilico: resultado cuantitativo.</w:t>
+            </w:r>
+          </w:p>
+        </w:tc>
+      </w:tr>
+      <w:tr>
+        <w:trPr/>
+        <w:tc>
+          <w:tcPr>
+            <w:tcW w:w="4500" w:type="dxa"/>
+            <w:noWrap/>
+          </w:tcPr>
+          <w:p>
+            <w:pPr/>
+            <w:r>
+              <w:rPr/>
+              <w:t xml:space="preserve">${PREFIX_fall_dosaje_lectura_cuant}</w:t>
+            </w:r>
+          </w:p>
+        </w:tc>
+        <w:tc>
+          <w:tcPr>
+            <w:tcW w:w="6500" w:type="dxa"/>
+            <w:noWrap/>
+          </w:tcPr>
+          <w:p>
+            <w:pPr/>
+            <w:r>
+              <w:rPr/>
+              <w:t xml:space="preserve">Dosaje etilico: lectura del resultado cuantitativo.</w:t>
+            </w:r>
+          </w:p>
+        </w:tc>
+      </w:tr>
+      <w:tr>
+        <w:trPr/>
+        <w:tc>
+          <w:tcPr>
+            <w:tcW w:w="4500" w:type="dxa"/>
+            <w:noWrap/>
+          </w:tcPr>
+          <w:p>
+            <w:pPr/>
+            <w:r>
+              <w:rPr/>
+              <w:t xml:space="preserve">${PREFIX_fall_dosaje_observaciones}</w:t>
+            </w:r>
+          </w:p>
+        </w:tc>
+        <w:tc>
+          <w:tcPr>
+            <w:tcW w:w="6500" w:type="dxa"/>
+            <w:noWrap/>
+          </w:tcPr>
+          <w:p>
+            <w:pPr/>
+            <w:r>
+              <w:rPr/>
+              <w:t xml:space="preserve">Dosaje etilico: observaciones.</w:t>
+            </w:r>
+          </w:p>
+        </w:tc>
+      </w:tr>
+      <w:tr>
+        <w:trPr/>
+        <w:tc>
+          <w:tcPr>
+            <w:tcW w:w="4500" w:type="dxa"/>
+            <w:noWrap/>
+          </w:tcPr>
+          <w:p>
+            <w:pPr/>
+            <w:r>
+              <w:rPr/>
+              <w:t xml:space="preserve">${PREFIX_dosaje_numero}</w:t>
+            </w:r>
+          </w:p>
+        </w:tc>
+        <w:tc>
+          <w:tcPr>
+            <w:tcW w:w="6500" w:type="dxa"/>
+            <w:noWrap/>
+          </w:tcPr>
+          <w:p>
+            <w:pPr/>
+            <w:r>
+              <w:rPr/>
+              <w:t xml:space="preserve">Alias de dosaje por peaton: numero del documento.</w:t>
+            </w:r>
+          </w:p>
+        </w:tc>
+      </w:tr>
+      <w:tr>
+        <w:trPr/>
+        <w:tc>
+          <w:tcPr>
+            <w:tcW w:w="4500" w:type="dxa"/>
+            <w:noWrap/>
+          </w:tcPr>
+          <w:p>
+            <w:pPr/>
+            <w:r>
+              <w:rPr/>
+              <w:t xml:space="preserve">${PREFIX_dosaje_registro}</w:t>
+            </w:r>
+          </w:p>
+        </w:tc>
+        <w:tc>
+          <w:tcPr>
+            <w:tcW w:w="6500" w:type="dxa"/>
+            <w:noWrap/>
+          </w:tcPr>
+          <w:p>
+            <w:pPr/>
+            <w:r>
+              <w:rPr/>
+              <w:t xml:space="preserve">Alias de dosaje por peaton: numero de registro.</w:t>
+            </w:r>
+          </w:p>
+        </w:tc>
+      </w:tr>
+      <w:tr>
+        <w:trPr/>
+        <w:tc>
+          <w:tcPr>
+            <w:tcW w:w="4500" w:type="dxa"/>
+            <w:noWrap/>
+          </w:tcPr>
+          <w:p>
+            <w:pPr/>
+            <w:r>
+              <w:rPr/>
+              <w:t xml:space="preserve">${PREFIX_dosaje_fecha}</w:t>
+            </w:r>
+          </w:p>
+        </w:tc>
+        <w:tc>
+          <w:tcPr>
+            <w:tcW w:w="6500" w:type="dxa"/>
+            <w:noWrap/>
+          </w:tcPr>
+          <w:p>
+            <w:pPr/>
+            <w:r>
+              <w:rPr/>
+              <w:t xml:space="preserve">Alias de dosaje por peaton: fecha de extraccion.</w:t>
+            </w:r>
+          </w:p>
+        </w:tc>
+      </w:tr>
+      <w:tr>
+        <w:trPr/>
+        <w:tc>
+          <w:tcPr>
+            <w:tcW w:w="4500" w:type="dxa"/>
+            <w:noWrap/>
+          </w:tcPr>
+          <w:p>
+            <w:pPr/>
+            <w:r>
+              <w:rPr/>
+              <w:t xml:space="preserve">${PREFIX_dosaje_hora}</w:t>
+            </w:r>
+          </w:p>
+        </w:tc>
+        <w:tc>
+          <w:tcPr>
+            <w:tcW w:w="6500" w:type="dxa"/>
+            <w:noWrap/>
+          </w:tcPr>
+          <w:p>
+            <w:pPr/>
+            <w:r>
+              <w:rPr/>
+              <w:t xml:space="preserve">Alias de dosaje por peaton: hora de extraccion.</w:t>
+            </w:r>
+          </w:p>
+        </w:tc>
+      </w:tr>
+      <w:tr>
+        <w:trPr/>
+        <w:tc>
+          <w:tcPr>
+            <w:tcW w:w="4500" w:type="dxa"/>
+            <w:noWrap/>
+          </w:tcPr>
+          <w:p>
+            <w:pPr/>
+            <w:r>
+              <w:rPr/>
+              <w:t xml:space="preserve">${PREFIX_dosaje_resultado_cual}</w:t>
+            </w:r>
+          </w:p>
+        </w:tc>
+        <w:tc>
+          <w:tcPr>
+            <w:tcW w:w="6500" w:type="dxa"/>
+            <w:noWrap/>
+          </w:tcPr>
+          <w:p>
+            <w:pPr/>
+            <w:r>
+              <w:rPr/>
+              <w:t xml:space="preserve">Alias de dosaje por peaton: resultado cualitativo.</w:t>
+            </w:r>
+          </w:p>
+        </w:tc>
+      </w:tr>
+      <w:tr>
+        <w:trPr/>
+        <w:tc>
+          <w:tcPr>
+            <w:tcW w:w="4500" w:type="dxa"/>
+            <w:noWrap/>
+          </w:tcPr>
+          <w:p>
+            <w:pPr/>
+            <w:r>
+              <w:rPr/>
+              <w:t xml:space="preserve">${PREFIX_dosaje_resultado_cuant}</w:t>
+            </w:r>
+          </w:p>
+        </w:tc>
+        <w:tc>
+          <w:tcPr>
+            <w:tcW w:w="6500" w:type="dxa"/>
+            <w:noWrap/>
+          </w:tcPr>
+          <w:p>
+            <w:pPr/>
+            <w:r>
+              <w:rPr/>
+              <w:t xml:space="preserve">Alias de dosaje por peaton: resultado cuantitativo.</w:t>
+            </w:r>
+          </w:p>
+        </w:tc>
+      </w:tr>
+      <w:tr>
+        <w:trPr/>
+        <w:tc>
+          <w:tcPr>
+            <w:tcW w:w="4500" w:type="dxa"/>
+            <w:noWrap/>
+          </w:tcPr>
+          <w:p>
+            <w:pPr/>
+            <w:r>
+              <w:rPr/>
+              <w:t xml:space="preserve">${PREFIX_dosaje_lectura_cuant}</w:t>
+            </w:r>
+          </w:p>
+        </w:tc>
+        <w:tc>
+          <w:tcPr>
+            <w:tcW w:w="6500" w:type="dxa"/>
+            <w:noWrap/>
+          </w:tcPr>
+          <w:p>
+            <w:pPr/>
+            <w:r>
+              <w:rPr/>
+              <w:t xml:space="preserve">Alias de dosaje por peaton: lectura cuantitativa.</w:t>
+            </w:r>
+          </w:p>
+        </w:tc>
+      </w:tr>
+      <w:tr>
+        <w:trPr/>
+        <w:tc>
+          <w:tcPr>
+            <w:tcW w:w="4500" w:type="dxa"/>
+            <w:noWrap/>
+          </w:tcPr>
+          <w:p>
+            <w:pPr/>
+            <w:r>
+              <w:rPr/>
+              <w:t xml:space="preserve">${PREFIX_dosaje_observaciones}</w:t>
+            </w:r>
+          </w:p>
+        </w:tc>
+        <w:tc>
+          <w:tcPr>
+            <w:tcW w:w="6500" w:type="dxa"/>
+            <w:noWrap/>
+          </w:tcPr>
+          <w:p>
+            <w:pPr/>
+            <w:r>
+              <w:rPr/>
+              <w:t xml:space="preserve">Alias de dosaje por peaton: observaciones.</w:t>
             </w:r>
           </w:p>
         </w:tc>
@@ -3285,11 +3631,11 @@
       <w:pPr>
         <w:pStyle w:val="Heading3"/>
       </w:pPr>
-      <w:bookmarkStart w:id="9" w:name="_Toc9"/>
-      <w:r>
-        <w:t>Familiar del fallecido</w:t>
-      </w:r>
-      <w:bookmarkEnd w:id="9"/>
+      <w:bookmarkStart w:id="8" w:name="_Toc8"/>
+      <w:r>
+        <w:t>Epicrisis</w:t>
+      </w:r>
+      <w:bookmarkEnd w:id="8"/>
     </w:p>
     <w:tbl>
       <w:tblGrid>
@@ -3345,745 +3691,107 @@
             <w:pPr/>
             <w:r>
               <w:rPr/>
-              <w:t xml:space="preserve">${PREFIX_fam_parentesco}</w:t>
-            </w:r>
-          </w:p>
-        </w:tc>
-        <w:tc>
-          <w:tcPr>
-            <w:tcW w:w="6500" w:type="dxa"/>
-            <w:noWrap/>
-          </w:tcPr>
-          <w:p>
-            <w:pPr/>
-            <w:r>
-              <w:rPr/>
-              <w:t xml:space="preserve">Parentesco con el fallecido.</w:t>
-            </w:r>
-          </w:p>
-        </w:tc>
-      </w:tr>
-      <w:tr>
-        <w:trPr/>
-        <w:tc>
-          <w:tcPr>
-            <w:tcW w:w="4500" w:type="dxa"/>
-            <w:noWrap/>
-          </w:tcPr>
-          <w:p>
-            <w:pPr/>
-            <w:r>
-              <w:rPr/>
-              <w:t xml:space="preserve">${PREFIX_fam_nombre}</w:t>
-            </w:r>
-          </w:p>
-        </w:tc>
-        <w:tc>
-          <w:tcPr>
-            <w:tcW w:w="6500" w:type="dxa"/>
-            <w:noWrap/>
-          </w:tcPr>
-          <w:p>
-            <w:pPr/>
-            <w:r>
-              <w:rPr/>
-              <w:t xml:space="preserve">Nombre completo del familiar.</w:t>
-            </w:r>
-          </w:p>
-        </w:tc>
-      </w:tr>
-      <w:tr>
-        <w:trPr/>
-        <w:tc>
-          <w:tcPr>
-            <w:tcW w:w="4500" w:type="dxa"/>
-            <w:noWrap/>
-          </w:tcPr>
-          <w:p>
-            <w:pPr/>
-            <w:r>
-              <w:rPr/>
-              <w:t xml:space="preserve">${PREFIX_fam_doc_tipo}</w:t>
-            </w:r>
-          </w:p>
-        </w:tc>
-        <w:tc>
-          <w:tcPr>
-            <w:tcW w:w="6500" w:type="dxa"/>
-            <w:noWrap/>
-          </w:tcPr>
-          <w:p>
-            <w:pPr/>
-            <w:r>
-              <w:rPr/>
-              <w:t xml:space="preserve">Tipo de documento del familiar.</w:t>
-            </w:r>
-          </w:p>
-        </w:tc>
-      </w:tr>
-      <w:tr>
-        <w:trPr/>
-        <w:tc>
-          <w:tcPr>
-            <w:tcW w:w="4500" w:type="dxa"/>
-            <w:noWrap/>
-          </w:tcPr>
-          <w:p>
-            <w:pPr/>
-            <w:r>
-              <w:rPr/>
-              <w:t xml:space="preserve">${PREFIX_fam_doc_num}</w:t>
-            </w:r>
-          </w:p>
-        </w:tc>
-        <w:tc>
-          <w:tcPr>
-            <w:tcW w:w="6500" w:type="dxa"/>
-            <w:noWrap/>
-          </w:tcPr>
-          <w:p>
-            <w:pPr/>
-            <w:r>
-              <w:rPr/>
-              <w:t xml:space="preserve">Numero de documento del familiar.</w:t>
-            </w:r>
-          </w:p>
-        </w:tc>
-      </w:tr>
-      <w:tr>
-        <w:trPr/>
-        <w:tc>
-          <w:tcPr>
-            <w:tcW w:w="4500" w:type="dxa"/>
-            <w:noWrap/>
-          </w:tcPr>
-          <w:p>
-            <w:pPr/>
-            <w:r>
-              <w:rPr/>
-              <w:t xml:space="preserve">${PREFIX_fam_doc}</w:t>
-            </w:r>
-          </w:p>
-        </w:tc>
-        <w:tc>
-          <w:tcPr>
-            <w:tcW w:w="6500" w:type="dxa"/>
-            <w:noWrap/>
-          </w:tcPr>
-          <w:p>
-            <w:pPr/>
-            <w:r>
-              <w:rPr/>
-              <w:t xml:space="preserve">Tipo y numero juntos.</w:t>
-            </w:r>
-          </w:p>
-        </w:tc>
-      </w:tr>
-      <w:tr>
-        <w:trPr/>
-        <w:tc>
-          <w:tcPr>
-            <w:tcW w:w="4500" w:type="dxa"/>
-            <w:noWrap/>
-          </w:tcPr>
-          <w:p>
-            <w:pPr/>
-            <w:r>
-              <w:rPr/>
-              <w:t xml:space="preserve">${PREFIX_fam_sexo}</w:t>
-            </w:r>
-          </w:p>
-        </w:tc>
-        <w:tc>
-          <w:tcPr>
-            <w:tcW w:w="6500" w:type="dxa"/>
-            <w:noWrap/>
-          </w:tcPr>
-          <w:p>
-            <w:pPr/>
-            <w:r>
-              <w:rPr/>
-              <w:t xml:space="preserve">Sexo.</w:t>
-            </w:r>
-          </w:p>
-        </w:tc>
-      </w:tr>
-      <w:tr>
-        <w:trPr/>
-        <w:tc>
-          <w:tcPr>
-            <w:tcW w:w="4500" w:type="dxa"/>
-            <w:noWrap/>
-          </w:tcPr>
-          <w:p>
-            <w:pPr/>
-            <w:r>
-              <w:rPr/>
-              <w:t xml:space="preserve">${PREFIX_fam_fecha_nacimiento}</w:t>
-            </w:r>
-          </w:p>
-        </w:tc>
-        <w:tc>
-          <w:tcPr>
-            <w:tcW w:w="6500" w:type="dxa"/>
-            <w:noWrap/>
-          </w:tcPr>
-          <w:p>
-            <w:pPr/>
-            <w:r>
-              <w:rPr/>
-              <w:t xml:space="preserve">Fecha de nacimiento.</w:t>
-            </w:r>
-          </w:p>
-        </w:tc>
-      </w:tr>
-      <w:tr>
-        <w:trPr/>
-        <w:tc>
-          <w:tcPr>
-            <w:tcW w:w="4500" w:type="dxa"/>
-            <w:noWrap/>
-          </w:tcPr>
-          <w:p>
-            <w:pPr/>
-            <w:r>
-              <w:rPr/>
-              <w:t xml:space="preserve">${PREFIX_fam_edad}</w:t>
-            </w:r>
-          </w:p>
-        </w:tc>
-        <w:tc>
-          <w:tcPr>
-            <w:tcW w:w="6500" w:type="dxa"/>
-            <w:noWrap/>
-          </w:tcPr>
-          <w:p>
-            <w:pPr/>
-            <w:r>
-              <w:rPr/>
-              <w:t xml:space="preserve">Edad actual calculada.</w:t>
-            </w:r>
-          </w:p>
-        </w:tc>
-      </w:tr>
-      <w:tr>
-        <w:trPr/>
-        <w:tc>
-          <w:tcPr>
-            <w:tcW w:w="4500" w:type="dxa"/>
-            <w:noWrap/>
-          </w:tcPr>
-          <w:p>
-            <w:pPr/>
-            <w:r>
-              <w:rPr/>
-              <w:t xml:space="preserve">${PREFIX_fam_edad_registrada}</w:t>
-            </w:r>
-          </w:p>
-        </w:tc>
-        <w:tc>
-          <w:tcPr>
-            <w:tcW w:w="6500" w:type="dxa"/>
-            <w:noWrap/>
-          </w:tcPr>
-          <w:p>
-            <w:pPr/>
-            <w:r>
-              <w:rPr/>
-              <w:t xml:space="preserve">Edad registrada en la ficha de persona.</w:t>
-            </w:r>
-          </w:p>
-        </w:tc>
-      </w:tr>
-      <w:tr>
-        <w:trPr/>
-        <w:tc>
-          <w:tcPr>
-            <w:tcW w:w="4500" w:type="dxa"/>
-            <w:noWrap/>
-          </w:tcPr>
-          <w:p>
-            <w:pPr/>
-            <w:r>
-              <w:rPr/>
-              <w:t xml:space="preserve">${PREFIX_fam_estado_civil}</w:t>
-            </w:r>
-          </w:p>
-        </w:tc>
-        <w:tc>
-          <w:tcPr>
-            <w:tcW w:w="6500" w:type="dxa"/>
-            <w:noWrap/>
-          </w:tcPr>
-          <w:p>
-            <w:pPr/>
-            <w:r>
-              <w:rPr/>
-              <w:t xml:space="preserve">Estado civil.</w:t>
-            </w:r>
-          </w:p>
-        </w:tc>
-      </w:tr>
-      <w:tr>
-        <w:trPr/>
-        <w:tc>
-          <w:tcPr>
-            <w:tcW w:w="4500" w:type="dxa"/>
-            <w:noWrap/>
-          </w:tcPr>
-          <w:p>
-            <w:pPr/>
-            <w:r>
-              <w:rPr/>
-              <w:t xml:space="preserve">${PREFIX_fam_nacionalidad}</w:t>
-            </w:r>
-          </w:p>
-        </w:tc>
-        <w:tc>
-          <w:tcPr>
-            <w:tcW w:w="6500" w:type="dxa"/>
-            <w:noWrap/>
-          </w:tcPr>
-          <w:p>
-            <w:pPr/>
-            <w:r>
-              <w:rPr/>
-              <w:t xml:space="preserve">Nacionalidad.</w:t>
-            </w:r>
-          </w:p>
-        </w:tc>
-      </w:tr>
-      <w:tr>
-        <w:trPr/>
-        <w:tc>
-          <w:tcPr>
-            <w:tcW w:w="4500" w:type="dxa"/>
-            <w:noWrap/>
-          </w:tcPr>
-          <w:p>
-            <w:pPr/>
-            <w:r>
-              <w:rPr/>
-              <w:t xml:space="preserve">${PREFIX_fam_nacimiento}</w:t>
-            </w:r>
-          </w:p>
-        </w:tc>
-        <w:tc>
-          <w:tcPr>
-            <w:tcW w:w="6500" w:type="dxa"/>
-            <w:noWrap/>
-          </w:tcPr>
-          <w:p>
-            <w:pPr/>
-            <w:r>
-              <w:rPr/>
-              <w:t xml:space="preserve">Departamento / provincia / distrito de nacimiento.</w:t>
-            </w:r>
-          </w:p>
-        </w:tc>
-      </w:tr>
-      <w:tr>
-        <w:trPr/>
-        <w:tc>
-          <w:tcPr>
-            <w:tcW w:w="4500" w:type="dxa"/>
-            <w:noWrap/>
-          </w:tcPr>
-          <w:p>
-            <w:pPr/>
-            <w:r>
-              <w:rPr/>
-              <w:t xml:space="preserve">${PREFIX_fam_domicilio}</w:t>
-            </w:r>
-          </w:p>
-        </w:tc>
-        <w:tc>
-          <w:tcPr>
-            <w:tcW w:w="6500" w:type="dxa"/>
-            <w:noWrap/>
-          </w:tcPr>
-          <w:p>
-            <w:pPr/>
-            <w:r>
-              <w:rPr/>
-              <w:t xml:space="preserve">Domicilio.</w:t>
-            </w:r>
-          </w:p>
-        </w:tc>
-      </w:tr>
-      <w:tr>
-        <w:trPr/>
-        <w:tc>
-          <w:tcPr>
-            <w:tcW w:w="4500" w:type="dxa"/>
-            <w:noWrap/>
-          </w:tcPr>
-          <w:p>
-            <w:pPr/>
-            <w:r>
-              <w:rPr/>
-              <w:t xml:space="preserve">${PREFIX_fam_domicilio_ubigeo}</w:t>
-            </w:r>
-          </w:p>
-        </w:tc>
-        <w:tc>
-          <w:tcPr>
-            <w:tcW w:w="6500" w:type="dxa"/>
-            <w:noWrap/>
-          </w:tcPr>
-          <w:p>
-            <w:pPr/>
-            <w:r>
-              <w:rPr/>
-              <w:t xml:space="preserve">Departamento / provincia / distrito del domicilio.</w:t>
-            </w:r>
-          </w:p>
-        </w:tc>
-      </w:tr>
-      <w:tr>
-        <w:trPr/>
-        <w:tc>
-          <w:tcPr>
-            <w:tcW w:w="4500" w:type="dxa"/>
-            <w:noWrap/>
-          </w:tcPr>
-          <w:p>
-            <w:pPr/>
-            <w:r>
-              <w:rPr/>
-              <w:t xml:space="preserve">${PREFIX_fam_ocupacion}</w:t>
-            </w:r>
-          </w:p>
-        </w:tc>
-        <w:tc>
-          <w:tcPr>
-            <w:tcW w:w="6500" w:type="dxa"/>
-            <w:noWrap/>
-          </w:tcPr>
-          <w:p>
-            <w:pPr/>
-            <w:r>
-              <w:rPr/>
-              <w:t xml:space="preserve">Ocupacion.</w:t>
-            </w:r>
-          </w:p>
-        </w:tc>
-      </w:tr>
-      <w:tr>
-        <w:trPr/>
-        <w:tc>
-          <w:tcPr>
-            <w:tcW w:w="4500" w:type="dxa"/>
-            <w:noWrap/>
-          </w:tcPr>
-          <w:p>
-            <w:pPr/>
-            <w:r>
-              <w:rPr/>
-              <w:t xml:space="preserve">${PREFIX_fam_grado_instruccion}</w:t>
-            </w:r>
-          </w:p>
-        </w:tc>
-        <w:tc>
-          <w:tcPr>
-            <w:tcW w:w="6500" w:type="dxa"/>
-            <w:noWrap/>
-          </w:tcPr>
-          <w:p>
-            <w:pPr/>
-            <w:r>
-              <w:rPr/>
-              <w:t xml:space="preserve">Grado de instruccion.</w:t>
-            </w:r>
-          </w:p>
-        </w:tc>
-      </w:tr>
-      <w:tr>
-        <w:trPr/>
-        <w:tc>
-          <w:tcPr>
-            <w:tcW w:w="4500" w:type="dxa"/>
-            <w:noWrap/>
-          </w:tcPr>
-          <w:p>
-            <w:pPr/>
-            <w:r>
-              <w:rPr/>
-              <w:t xml:space="preserve">${PREFIX_fam_padre}</w:t>
-            </w:r>
-          </w:p>
-        </w:tc>
-        <w:tc>
-          <w:tcPr>
-            <w:tcW w:w="6500" w:type="dxa"/>
-            <w:noWrap/>
-          </w:tcPr>
-          <w:p>
-            <w:pPr/>
-            <w:r>
-              <w:rPr/>
-              <w:t xml:space="preserve">Nombre del padre.</w:t>
-            </w:r>
-          </w:p>
-        </w:tc>
-      </w:tr>
-      <w:tr>
-        <w:trPr/>
-        <w:tc>
-          <w:tcPr>
-            <w:tcW w:w="4500" w:type="dxa"/>
-            <w:noWrap/>
-          </w:tcPr>
-          <w:p>
-            <w:pPr/>
-            <w:r>
-              <w:rPr/>
-              <w:t xml:space="preserve">${PREFIX_fam_madre}</w:t>
-            </w:r>
-          </w:p>
-        </w:tc>
-        <w:tc>
-          <w:tcPr>
-            <w:tcW w:w="6500" w:type="dxa"/>
-            <w:noWrap/>
-          </w:tcPr>
-          <w:p>
-            <w:pPr/>
-            <w:r>
-              <w:rPr/>
-              <w:t xml:space="preserve">Nombre de la madre.</w:t>
-            </w:r>
-          </w:p>
-        </w:tc>
-      </w:tr>
-      <w:tr>
-        <w:trPr/>
-        <w:tc>
-          <w:tcPr>
-            <w:tcW w:w="4500" w:type="dxa"/>
-            <w:noWrap/>
-          </w:tcPr>
-          <w:p>
-            <w:pPr/>
-            <w:r>
-              <w:rPr/>
-              <w:t xml:space="preserve">${PREFIX_fam_celular}</w:t>
-            </w:r>
-          </w:p>
-        </w:tc>
-        <w:tc>
-          <w:tcPr>
-            <w:tcW w:w="6500" w:type="dxa"/>
-            <w:noWrap/>
-          </w:tcPr>
-          <w:p>
-            <w:pPr/>
-            <w:r>
-              <w:rPr/>
-              <w:t xml:space="preserve">Celular.</w:t>
-            </w:r>
-          </w:p>
-        </w:tc>
-      </w:tr>
-      <w:tr>
-        <w:trPr/>
-        <w:tc>
-          <w:tcPr>
-            <w:tcW w:w="4500" w:type="dxa"/>
-            <w:noWrap/>
-          </w:tcPr>
-          <w:p>
-            <w:pPr/>
-            <w:r>
-              <w:rPr/>
-              <w:t xml:space="preserve">${PREFIX_fam_email}</w:t>
-            </w:r>
-          </w:p>
-        </w:tc>
-        <w:tc>
-          <w:tcPr>
-            <w:tcW w:w="6500" w:type="dxa"/>
-            <w:noWrap/>
-          </w:tcPr>
-          <w:p>
-            <w:pPr/>
-            <w:r>
-              <w:rPr/>
-              <w:t xml:space="preserve">Email.</w:t>
-            </w:r>
-          </w:p>
-        </w:tc>
-      </w:tr>
-      <w:tr>
-        <w:trPr/>
-        <w:tc>
-          <w:tcPr>
-            <w:tcW w:w="4500" w:type="dxa"/>
-            <w:noWrap/>
-          </w:tcPr>
-          <w:p>
-            <w:pPr/>
-            <w:r>
-              <w:rPr/>
-              <w:t xml:space="preserve">${PREFIX_fam_notas}</w:t>
-            </w:r>
-          </w:p>
-        </w:tc>
-        <w:tc>
-          <w:tcPr>
-            <w:tcW w:w="6500" w:type="dxa"/>
-            <w:noWrap/>
-          </w:tcPr>
-          <w:p>
-            <w:pPr/>
-            <w:r>
-              <w:rPr/>
-              <w:t xml:space="preserve">Notas de la ficha de persona.</w:t>
-            </w:r>
-          </w:p>
-        </w:tc>
-      </w:tr>
-      <w:tr>
-        <w:trPr/>
-        <w:tc>
-          <w:tcPr>
-            <w:tcW w:w="4500" w:type="dxa"/>
-            <w:noWrap/>
-          </w:tcPr>
-          <w:p>
-            <w:pPr/>
-            <w:r>
-              <w:rPr/>
-              <w:t xml:space="preserve">${PREFIX_fam_creado_en}</w:t>
-            </w:r>
-          </w:p>
-        </w:tc>
-        <w:tc>
-          <w:tcPr>
-            <w:tcW w:w="6500" w:type="dxa"/>
-            <w:noWrap/>
-          </w:tcPr>
-          <w:p>
-            <w:pPr/>
-            <w:r>
-              <w:rPr/>
-              <w:t xml:space="preserve">Fecha de creacion de la ficha de persona.</w:t>
-            </w:r>
-          </w:p>
-        </w:tc>
-      </w:tr>
-      <w:tr>
-        <w:trPr/>
-        <w:tc>
-          <w:tcPr>
-            <w:tcW w:w="4500" w:type="dxa"/>
-            <w:noWrap/>
-          </w:tcPr>
-          <w:p>
-            <w:pPr/>
-            <w:r>
-              <w:rPr/>
-              <w:t xml:space="preserve">${PREFIX_fam_foto_path}</w:t>
-            </w:r>
-          </w:p>
-        </w:tc>
-        <w:tc>
-          <w:tcPr>
-            <w:tcW w:w="6500" w:type="dxa"/>
-            <w:noWrap/>
-          </w:tcPr>
-          <w:p>
-            <w:pPr/>
-            <w:r>
-              <w:rPr/>
-              <w:t xml:space="preserve">Ruta de foto de la persona.</w:t>
-            </w:r>
-          </w:p>
-        </w:tc>
-      </w:tr>
-      <w:tr>
-        <w:trPr/>
-        <w:tc>
-          <w:tcPr>
-            <w:tcW w:w="4500" w:type="dxa"/>
-            <w:noWrap/>
-          </w:tcPr>
-          <w:p>
-            <w:pPr/>
-            <w:r>
-              <w:rPr/>
-              <w:t xml:space="preserve">${PREFIX_fam_api_fuente}</w:t>
-            </w:r>
-          </w:p>
-        </w:tc>
-        <w:tc>
-          <w:tcPr>
-            <w:tcW w:w="6500" w:type="dxa"/>
-            <w:noWrap/>
-          </w:tcPr>
-          <w:p>
-            <w:pPr/>
-            <w:r>
-              <w:rPr/>
-              <w:t xml:space="preserve">Fuente API de la ficha, si corresponde.</w:t>
-            </w:r>
-          </w:p>
-        </w:tc>
-      </w:tr>
-      <w:tr>
-        <w:trPr/>
-        <w:tc>
-          <w:tcPr>
-            <w:tcW w:w="4500" w:type="dxa"/>
-            <w:noWrap/>
-          </w:tcPr>
-          <w:p>
-            <w:pPr/>
-            <w:r>
-              <w:rPr/>
-              <w:t xml:space="preserve">${PREFIX_fam_api_ref}</w:t>
-            </w:r>
-          </w:p>
-        </w:tc>
-        <w:tc>
-          <w:tcPr>
-            <w:tcW w:w="6500" w:type="dxa"/>
-            <w:noWrap/>
-          </w:tcPr>
-          <w:p>
-            <w:pPr/>
-            <w:r>
-              <w:rPr/>
-              <w:t xml:space="preserve">Referencia API de la ficha, si corresponde.</w:t>
-            </w:r>
-          </w:p>
-        </w:tc>
-      </w:tr>
-      <w:tr>
-        <w:trPr/>
-        <w:tc>
-          <w:tcPr>
-            <w:tcW w:w="4500" w:type="dxa"/>
-            <w:noWrap/>
-          </w:tcPr>
-          <w:p>
-            <w:pPr/>
-            <w:r>
-              <w:rPr/>
-              <w:t xml:space="preserve">${PREFIX_fam_observaciones}</w:t>
-            </w:r>
-          </w:p>
-        </w:tc>
-        <w:tc>
-          <w:tcPr>
-            <w:tcW w:w="6500" w:type="dxa"/>
-            <w:noWrap/>
-          </w:tcPr>
-          <w:p>
-            <w:pPr/>
-            <w:r>
-              <w:rPr/>
-              <w:t xml:space="preserve">Observaciones del vinculo familiar.</w:t>
+              <w:t xml:space="preserve">${PREFIX_occ_nosocomio_epicrisis}</w:t>
+            </w:r>
+          </w:p>
+        </w:tc>
+        <w:tc>
+          <w:tcPr>
+            <w:tcW w:w="6500" w:type="dxa"/>
+            <w:noWrap/>
+          </w:tcPr>
+          <w:p>
+            <w:pPr/>
+            <w:r>
+              <w:rPr/>
+              <w:t xml:space="preserve">Epicrisis: nosocomio.</w:t>
+            </w:r>
+          </w:p>
+        </w:tc>
+      </w:tr>
+      <w:tr>
+        <w:trPr/>
+        <w:tc>
+          <w:tcPr>
+            <w:tcW w:w="4500" w:type="dxa"/>
+            <w:noWrap/>
+          </w:tcPr>
+          <w:p>
+            <w:pPr/>
+            <w:r>
+              <w:rPr/>
+              <w:t xml:space="preserve">${PREFIX_occ_numero_historia_epicrisis}</w:t>
+            </w:r>
+          </w:p>
+        </w:tc>
+        <w:tc>
+          <w:tcPr>
+            <w:tcW w:w="6500" w:type="dxa"/>
+            <w:noWrap/>
+          </w:tcPr>
+          <w:p>
+            <w:pPr/>
+            <w:r>
+              <w:rPr/>
+              <w:t xml:space="preserve">Epicrisis: numero de historia.</w:t>
+            </w:r>
+          </w:p>
+        </w:tc>
+      </w:tr>
+      <w:tr>
+        <w:trPr/>
+        <w:tc>
+          <w:tcPr>
+            <w:tcW w:w="4500" w:type="dxa"/>
+            <w:noWrap/>
+          </w:tcPr>
+          <w:p>
+            <w:pPr/>
+            <w:r>
+              <w:rPr/>
+              <w:t xml:space="preserve">${PREFIX_occ_tratamiento_epicrisis}</w:t>
+            </w:r>
+          </w:p>
+        </w:tc>
+        <w:tc>
+          <w:tcPr>
+            <w:tcW w:w="6500" w:type="dxa"/>
+            <w:noWrap/>
+          </w:tcPr>
+          <w:p>
+            <w:pPr/>
+            <w:r>
+              <w:rPr/>
+              <w:t xml:space="preserve">Epicrisis: tratamiento.</w:t>
+            </w:r>
+          </w:p>
+        </w:tc>
+      </w:tr>
+      <w:tr>
+        <w:trPr/>
+        <w:tc>
+          <w:tcPr>
+            <w:tcW w:w="4500" w:type="dxa"/>
+            <w:noWrap/>
+          </w:tcPr>
+          <w:p>
+            <w:pPr/>
+            <w:r>
+              <w:rPr/>
+              <w:t xml:space="preserve">${PREFIX_occ_hora_alta_epicrisis}</w:t>
+            </w:r>
+          </w:p>
+        </w:tc>
+        <w:tc>
+          <w:tcPr>
+            <w:tcW w:w="6500" w:type="dxa"/>
+            <w:noWrap/>
+          </w:tcPr>
+          <w:p>
+            <w:pPr/>
+            <w:r>
+              <w:rPr/>
+              <w:t xml:space="preserve">Epicrisis: hora de alta.</w:t>
             </w:r>
           </w:p>
         </w:tc>
@@ -4094,11 +3802,11 @@
       <w:pPr>
         <w:pStyle w:val="Heading3"/>
       </w:pPr>
-      <w:bookmarkStart w:id="10" w:name="_Toc10"/>
-      <w:r>
-        <w:t>Abogado del familiar</w:t>
-      </w:r>
-      <w:bookmarkEnd w:id="10"/>
+      <w:bookmarkStart w:id="9" w:name="_Toc9"/>
+      <w:r>
+        <w:t>Familiar del fallecido</w:t>
+      </w:r>
+      <w:bookmarkEnd w:id="9"/>
     </w:p>
     <w:tbl>
       <w:tblGrid>
@@ -4154,6 +3862,815 @@
             <w:pPr/>
             <w:r>
               <w:rPr/>
+              <w:t xml:space="preserve">${PREFIX_fam_parentesco}</w:t>
+            </w:r>
+          </w:p>
+        </w:tc>
+        <w:tc>
+          <w:tcPr>
+            <w:tcW w:w="6500" w:type="dxa"/>
+            <w:noWrap/>
+          </w:tcPr>
+          <w:p>
+            <w:pPr/>
+            <w:r>
+              <w:rPr/>
+              <w:t xml:space="preserve">Parentesco con el fallecido.</w:t>
+            </w:r>
+          </w:p>
+        </w:tc>
+      </w:tr>
+      <w:tr>
+        <w:trPr/>
+        <w:tc>
+          <w:tcPr>
+            <w:tcW w:w="4500" w:type="dxa"/>
+            <w:noWrap/>
+          </w:tcPr>
+          <w:p>
+            <w:pPr/>
+            <w:r>
+              <w:rPr/>
+              <w:t xml:space="preserve">${PREFIX_fam_nombre}</w:t>
+            </w:r>
+          </w:p>
+        </w:tc>
+        <w:tc>
+          <w:tcPr>
+            <w:tcW w:w="6500" w:type="dxa"/>
+            <w:noWrap/>
+          </w:tcPr>
+          <w:p>
+            <w:pPr/>
+            <w:r>
+              <w:rPr/>
+              <w:t xml:space="preserve">Nombre completo del familiar.</w:t>
+            </w:r>
+          </w:p>
+        </w:tc>
+      </w:tr>
+      <w:tr>
+        <w:trPr/>
+        <w:tc>
+          <w:tcPr>
+            <w:tcW w:w="4500" w:type="dxa"/>
+            <w:noWrap/>
+          </w:tcPr>
+          <w:p>
+            <w:pPr/>
+            <w:r>
+              <w:rPr/>
+              <w:t xml:space="preserve">${PREFIX_fam_doc_tipo}</w:t>
+            </w:r>
+          </w:p>
+        </w:tc>
+        <w:tc>
+          <w:tcPr>
+            <w:tcW w:w="6500" w:type="dxa"/>
+            <w:noWrap/>
+          </w:tcPr>
+          <w:p>
+            <w:pPr/>
+            <w:r>
+              <w:rPr/>
+              <w:t xml:space="preserve">Tipo de documento del familiar.</w:t>
+            </w:r>
+          </w:p>
+        </w:tc>
+      </w:tr>
+      <w:tr>
+        <w:trPr/>
+        <w:tc>
+          <w:tcPr>
+            <w:tcW w:w="4500" w:type="dxa"/>
+            <w:noWrap/>
+          </w:tcPr>
+          <w:p>
+            <w:pPr/>
+            <w:r>
+              <w:rPr/>
+              <w:t xml:space="preserve">${PREFIX_fam_doc_num}</w:t>
+            </w:r>
+          </w:p>
+        </w:tc>
+        <w:tc>
+          <w:tcPr>
+            <w:tcW w:w="6500" w:type="dxa"/>
+            <w:noWrap/>
+          </w:tcPr>
+          <w:p>
+            <w:pPr/>
+            <w:r>
+              <w:rPr/>
+              <w:t xml:space="preserve">Numero de documento del familiar.</w:t>
+            </w:r>
+          </w:p>
+        </w:tc>
+      </w:tr>
+      <w:tr>
+        <w:trPr/>
+        <w:tc>
+          <w:tcPr>
+            <w:tcW w:w="4500" w:type="dxa"/>
+            <w:noWrap/>
+          </w:tcPr>
+          <w:p>
+            <w:pPr/>
+            <w:r>
+              <w:rPr/>
+              <w:t xml:space="preserve">${PREFIX_fam_doc}</w:t>
+            </w:r>
+          </w:p>
+        </w:tc>
+        <w:tc>
+          <w:tcPr>
+            <w:tcW w:w="6500" w:type="dxa"/>
+            <w:noWrap/>
+          </w:tcPr>
+          <w:p>
+            <w:pPr/>
+            <w:r>
+              <w:rPr/>
+              <w:t xml:space="preserve">Tipo y numero juntos.</w:t>
+            </w:r>
+          </w:p>
+        </w:tc>
+      </w:tr>
+      <w:tr>
+        <w:trPr/>
+        <w:tc>
+          <w:tcPr>
+            <w:tcW w:w="4500" w:type="dxa"/>
+            <w:noWrap/>
+          </w:tcPr>
+          <w:p>
+            <w:pPr/>
+            <w:r>
+              <w:rPr/>
+              <w:t xml:space="preserve">${PREFIX_fam_sexo}</w:t>
+            </w:r>
+          </w:p>
+        </w:tc>
+        <w:tc>
+          <w:tcPr>
+            <w:tcW w:w="6500" w:type="dxa"/>
+            <w:noWrap/>
+          </w:tcPr>
+          <w:p>
+            <w:pPr/>
+            <w:r>
+              <w:rPr/>
+              <w:t xml:space="preserve">Sexo.</w:t>
+            </w:r>
+          </w:p>
+        </w:tc>
+      </w:tr>
+      <w:tr>
+        <w:trPr/>
+        <w:tc>
+          <w:tcPr>
+            <w:tcW w:w="4500" w:type="dxa"/>
+            <w:noWrap/>
+          </w:tcPr>
+          <w:p>
+            <w:pPr/>
+            <w:r>
+              <w:rPr/>
+              <w:t xml:space="preserve">${PREFIX_fam_fecha_nacimiento}</w:t>
+            </w:r>
+          </w:p>
+        </w:tc>
+        <w:tc>
+          <w:tcPr>
+            <w:tcW w:w="6500" w:type="dxa"/>
+            <w:noWrap/>
+          </w:tcPr>
+          <w:p>
+            <w:pPr/>
+            <w:r>
+              <w:rPr/>
+              <w:t xml:space="preserve">Fecha de nacimiento.</w:t>
+            </w:r>
+          </w:p>
+        </w:tc>
+      </w:tr>
+      <w:tr>
+        <w:trPr/>
+        <w:tc>
+          <w:tcPr>
+            <w:tcW w:w="4500" w:type="dxa"/>
+            <w:noWrap/>
+          </w:tcPr>
+          <w:p>
+            <w:pPr/>
+            <w:r>
+              <w:rPr/>
+              <w:t xml:space="preserve">${PREFIX_fam_edad}</w:t>
+            </w:r>
+          </w:p>
+        </w:tc>
+        <w:tc>
+          <w:tcPr>
+            <w:tcW w:w="6500" w:type="dxa"/>
+            <w:noWrap/>
+          </w:tcPr>
+          <w:p>
+            <w:pPr/>
+            <w:r>
+              <w:rPr/>
+              <w:t xml:space="preserve">Edad actual calculada.</w:t>
+            </w:r>
+          </w:p>
+        </w:tc>
+      </w:tr>
+      <w:tr>
+        <w:trPr/>
+        <w:tc>
+          <w:tcPr>
+            <w:tcW w:w="4500" w:type="dxa"/>
+            <w:noWrap/>
+          </w:tcPr>
+          <w:p>
+            <w:pPr/>
+            <w:r>
+              <w:rPr/>
+              <w:t xml:space="preserve">${PREFIX_fam_edad_registrada}</w:t>
+            </w:r>
+          </w:p>
+        </w:tc>
+        <w:tc>
+          <w:tcPr>
+            <w:tcW w:w="6500" w:type="dxa"/>
+            <w:noWrap/>
+          </w:tcPr>
+          <w:p>
+            <w:pPr/>
+            <w:r>
+              <w:rPr/>
+              <w:t xml:space="preserve">Edad registrada en la ficha de persona.</w:t>
+            </w:r>
+          </w:p>
+        </w:tc>
+      </w:tr>
+      <w:tr>
+        <w:trPr/>
+        <w:tc>
+          <w:tcPr>
+            <w:tcW w:w="4500" w:type="dxa"/>
+            <w:noWrap/>
+          </w:tcPr>
+          <w:p>
+            <w:pPr/>
+            <w:r>
+              <w:rPr/>
+              <w:t xml:space="preserve">${PREFIX_fam_estado_civil}</w:t>
+            </w:r>
+          </w:p>
+        </w:tc>
+        <w:tc>
+          <w:tcPr>
+            <w:tcW w:w="6500" w:type="dxa"/>
+            <w:noWrap/>
+          </w:tcPr>
+          <w:p>
+            <w:pPr/>
+            <w:r>
+              <w:rPr/>
+              <w:t xml:space="preserve">Estado civil.</w:t>
+            </w:r>
+          </w:p>
+        </w:tc>
+      </w:tr>
+      <w:tr>
+        <w:trPr/>
+        <w:tc>
+          <w:tcPr>
+            <w:tcW w:w="4500" w:type="dxa"/>
+            <w:noWrap/>
+          </w:tcPr>
+          <w:p>
+            <w:pPr/>
+            <w:r>
+              <w:rPr/>
+              <w:t xml:space="preserve">${PREFIX_fam_nacionalidad}</w:t>
+            </w:r>
+          </w:p>
+        </w:tc>
+        <w:tc>
+          <w:tcPr>
+            <w:tcW w:w="6500" w:type="dxa"/>
+            <w:noWrap/>
+          </w:tcPr>
+          <w:p>
+            <w:pPr/>
+            <w:r>
+              <w:rPr/>
+              <w:t xml:space="preserve">Nacionalidad.</w:t>
+            </w:r>
+          </w:p>
+        </w:tc>
+      </w:tr>
+      <w:tr>
+        <w:trPr/>
+        <w:tc>
+          <w:tcPr>
+            <w:tcW w:w="4500" w:type="dxa"/>
+            <w:noWrap/>
+          </w:tcPr>
+          <w:p>
+            <w:pPr/>
+            <w:r>
+              <w:rPr/>
+              <w:t xml:space="preserve">${PREFIX_fam_nacimiento}</w:t>
+            </w:r>
+          </w:p>
+        </w:tc>
+        <w:tc>
+          <w:tcPr>
+            <w:tcW w:w="6500" w:type="dxa"/>
+            <w:noWrap/>
+          </w:tcPr>
+          <w:p>
+            <w:pPr/>
+            <w:r>
+              <w:rPr/>
+              <w:t xml:space="preserve">Departamento / provincia / distrito de nacimiento.</w:t>
+            </w:r>
+          </w:p>
+        </w:tc>
+      </w:tr>
+      <w:tr>
+        <w:trPr/>
+        <w:tc>
+          <w:tcPr>
+            <w:tcW w:w="4500" w:type="dxa"/>
+            <w:noWrap/>
+          </w:tcPr>
+          <w:p>
+            <w:pPr/>
+            <w:r>
+              <w:rPr/>
+              <w:t xml:space="preserve">${PREFIX_fam_domicilio}</w:t>
+            </w:r>
+          </w:p>
+        </w:tc>
+        <w:tc>
+          <w:tcPr>
+            <w:tcW w:w="6500" w:type="dxa"/>
+            <w:noWrap/>
+          </w:tcPr>
+          <w:p>
+            <w:pPr/>
+            <w:r>
+              <w:rPr/>
+              <w:t xml:space="preserve">Domicilio.</w:t>
+            </w:r>
+          </w:p>
+        </w:tc>
+      </w:tr>
+      <w:tr>
+        <w:trPr/>
+        <w:tc>
+          <w:tcPr>
+            <w:tcW w:w="4500" w:type="dxa"/>
+            <w:noWrap/>
+          </w:tcPr>
+          <w:p>
+            <w:pPr/>
+            <w:r>
+              <w:rPr/>
+              <w:t xml:space="preserve">${PREFIX_fam_domicilio_ubigeo}</w:t>
+            </w:r>
+          </w:p>
+        </w:tc>
+        <w:tc>
+          <w:tcPr>
+            <w:tcW w:w="6500" w:type="dxa"/>
+            <w:noWrap/>
+          </w:tcPr>
+          <w:p>
+            <w:pPr/>
+            <w:r>
+              <w:rPr/>
+              <w:t xml:space="preserve">Departamento / provincia / distrito del domicilio.</w:t>
+            </w:r>
+          </w:p>
+        </w:tc>
+      </w:tr>
+      <w:tr>
+        <w:trPr/>
+        <w:tc>
+          <w:tcPr>
+            <w:tcW w:w="4500" w:type="dxa"/>
+            <w:noWrap/>
+          </w:tcPr>
+          <w:p>
+            <w:pPr/>
+            <w:r>
+              <w:rPr/>
+              <w:t xml:space="preserve">${PREFIX_fam_ocupacion}</w:t>
+            </w:r>
+          </w:p>
+        </w:tc>
+        <w:tc>
+          <w:tcPr>
+            <w:tcW w:w="6500" w:type="dxa"/>
+            <w:noWrap/>
+          </w:tcPr>
+          <w:p>
+            <w:pPr/>
+            <w:r>
+              <w:rPr/>
+              <w:t xml:space="preserve">Ocupacion.</w:t>
+            </w:r>
+          </w:p>
+        </w:tc>
+      </w:tr>
+      <w:tr>
+        <w:trPr/>
+        <w:tc>
+          <w:tcPr>
+            <w:tcW w:w="4500" w:type="dxa"/>
+            <w:noWrap/>
+          </w:tcPr>
+          <w:p>
+            <w:pPr/>
+            <w:r>
+              <w:rPr/>
+              <w:t xml:space="preserve">${PREFIX_fam_grado_instruccion}</w:t>
+            </w:r>
+          </w:p>
+        </w:tc>
+        <w:tc>
+          <w:tcPr>
+            <w:tcW w:w="6500" w:type="dxa"/>
+            <w:noWrap/>
+          </w:tcPr>
+          <w:p>
+            <w:pPr/>
+            <w:r>
+              <w:rPr/>
+              <w:t xml:space="preserve">Grado de instruccion.</w:t>
+            </w:r>
+          </w:p>
+        </w:tc>
+      </w:tr>
+      <w:tr>
+        <w:trPr/>
+        <w:tc>
+          <w:tcPr>
+            <w:tcW w:w="4500" w:type="dxa"/>
+            <w:noWrap/>
+          </w:tcPr>
+          <w:p>
+            <w:pPr/>
+            <w:r>
+              <w:rPr/>
+              <w:t xml:space="preserve">${PREFIX_fam_padre}</w:t>
+            </w:r>
+          </w:p>
+        </w:tc>
+        <w:tc>
+          <w:tcPr>
+            <w:tcW w:w="6500" w:type="dxa"/>
+            <w:noWrap/>
+          </w:tcPr>
+          <w:p>
+            <w:pPr/>
+            <w:r>
+              <w:rPr/>
+              <w:t xml:space="preserve">Nombre del padre.</w:t>
+            </w:r>
+          </w:p>
+        </w:tc>
+      </w:tr>
+      <w:tr>
+        <w:trPr/>
+        <w:tc>
+          <w:tcPr>
+            <w:tcW w:w="4500" w:type="dxa"/>
+            <w:noWrap/>
+          </w:tcPr>
+          <w:p>
+            <w:pPr/>
+            <w:r>
+              <w:rPr/>
+              <w:t xml:space="preserve">${PREFIX_fam_madre}</w:t>
+            </w:r>
+          </w:p>
+        </w:tc>
+        <w:tc>
+          <w:tcPr>
+            <w:tcW w:w="6500" w:type="dxa"/>
+            <w:noWrap/>
+          </w:tcPr>
+          <w:p>
+            <w:pPr/>
+            <w:r>
+              <w:rPr/>
+              <w:t xml:space="preserve">Nombre de la madre.</w:t>
+            </w:r>
+          </w:p>
+        </w:tc>
+      </w:tr>
+      <w:tr>
+        <w:trPr/>
+        <w:tc>
+          <w:tcPr>
+            <w:tcW w:w="4500" w:type="dxa"/>
+            <w:noWrap/>
+          </w:tcPr>
+          <w:p>
+            <w:pPr/>
+            <w:r>
+              <w:rPr/>
+              <w:t xml:space="preserve">${PREFIX_fam_celular}</w:t>
+            </w:r>
+          </w:p>
+        </w:tc>
+        <w:tc>
+          <w:tcPr>
+            <w:tcW w:w="6500" w:type="dxa"/>
+            <w:noWrap/>
+          </w:tcPr>
+          <w:p>
+            <w:pPr/>
+            <w:r>
+              <w:rPr/>
+              <w:t xml:space="preserve">Celular.</w:t>
+            </w:r>
+          </w:p>
+        </w:tc>
+      </w:tr>
+      <w:tr>
+        <w:trPr/>
+        <w:tc>
+          <w:tcPr>
+            <w:tcW w:w="4500" w:type="dxa"/>
+            <w:noWrap/>
+          </w:tcPr>
+          <w:p>
+            <w:pPr/>
+            <w:r>
+              <w:rPr/>
+              <w:t xml:space="preserve">${PREFIX_fam_email}</w:t>
+            </w:r>
+          </w:p>
+        </w:tc>
+        <w:tc>
+          <w:tcPr>
+            <w:tcW w:w="6500" w:type="dxa"/>
+            <w:noWrap/>
+          </w:tcPr>
+          <w:p>
+            <w:pPr/>
+            <w:r>
+              <w:rPr/>
+              <w:t xml:space="preserve">Email.</w:t>
+            </w:r>
+          </w:p>
+        </w:tc>
+      </w:tr>
+      <w:tr>
+        <w:trPr/>
+        <w:tc>
+          <w:tcPr>
+            <w:tcW w:w="4500" w:type="dxa"/>
+            <w:noWrap/>
+          </w:tcPr>
+          <w:p>
+            <w:pPr/>
+            <w:r>
+              <w:rPr/>
+              <w:t xml:space="preserve">${PREFIX_fam_notas}</w:t>
+            </w:r>
+          </w:p>
+        </w:tc>
+        <w:tc>
+          <w:tcPr>
+            <w:tcW w:w="6500" w:type="dxa"/>
+            <w:noWrap/>
+          </w:tcPr>
+          <w:p>
+            <w:pPr/>
+            <w:r>
+              <w:rPr/>
+              <w:t xml:space="preserve">Notas de la ficha de persona.</w:t>
+            </w:r>
+          </w:p>
+        </w:tc>
+      </w:tr>
+      <w:tr>
+        <w:trPr/>
+        <w:tc>
+          <w:tcPr>
+            <w:tcW w:w="4500" w:type="dxa"/>
+            <w:noWrap/>
+          </w:tcPr>
+          <w:p>
+            <w:pPr/>
+            <w:r>
+              <w:rPr/>
+              <w:t xml:space="preserve">${PREFIX_fam_creado_en}</w:t>
+            </w:r>
+          </w:p>
+        </w:tc>
+        <w:tc>
+          <w:tcPr>
+            <w:tcW w:w="6500" w:type="dxa"/>
+            <w:noWrap/>
+          </w:tcPr>
+          <w:p>
+            <w:pPr/>
+            <w:r>
+              <w:rPr/>
+              <w:t xml:space="preserve">Fecha de creacion de la ficha de persona.</w:t>
+            </w:r>
+          </w:p>
+        </w:tc>
+      </w:tr>
+      <w:tr>
+        <w:trPr/>
+        <w:tc>
+          <w:tcPr>
+            <w:tcW w:w="4500" w:type="dxa"/>
+            <w:noWrap/>
+          </w:tcPr>
+          <w:p>
+            <w:pPr/>
+            <w:r>
+              <w:rPr/>
+              <w:t xml:space="preserve">${PREFIX_fam_foto_path}</w:t>
+            </w:r>
+          </w:p>
+        </w:tc>
+        <w:tc>
+          <w:tcPr>
+            <w:tcW w:w="6500" w:type="dxa"/>
+            <w:noWrap/>
+          </w:tcPr>
+          <w:p>
+            <w:pPr/>
+            <w:r>
+              <w:rPr/>
+              <w:t xml:space="preserve">Ruta de foto de la persona.</w:t>
+            </w:r>
+          </w:p>
+        </w:tc>
+      </w:tr>
+      <w:tr>
+        <w:trPr/>
+        <w:tc>
+          <w:tcPr>
+            <w:tcW w:w="4500" w:type="dxa"/>
+            <w:noWrap/>
+          </w:tcPr>
+          <w:p>
+            <w:pPr/>
+            <w:r>
+              <w:rPr/>
+              <w:t xml:space="preserve">${PREFIX_fam_api_fuente}</w:t>
+            </w:r>
+          </w:p>
+        </w:tc>
+        <w:tc>
+          <w:tcPr>
+            <w:tcW w:w="6500" w:type="dxa"/>
+            <w:noWrap/>
+          </w:tcPr>
+          <w:p>
+            <w:pPr/>
+            <w:r>
+              <w:rPr/>
+              <w:t xml:space="preserve">Fuente API de la ficha, si corresponde.</w:t>
+            </w:r>
+          </w:p>
+        </w:tc>
+      </w:tr>
+      <w:tr>
+        <w:trPr/>
+        <w:tc>
+          <w:tcPr>
+            <w:tcW w:w="4500" w:type="dxa"/>
+            <w:noWrap/>
+          </w:tcPr>
+          <w:p>
+            <w:pPr/>
+            <w:r>
+              <w:rPr/>
+              <w:t xml:space="preserve">${PREFIX_fam_api_ref}</w:t>
+            </w:r>
+          </w:p>
+        </w:tc>
+        <w:tc>
+          <w:tcPr>
+            <w:tcW w:w="6500" w:type="dxa"/>
+            <w:noWrap/>
+          </w:tcPr>
+          <w:p>
+            <w:pPr/>
+            <w:r>
+              <w:rPr/>
+              <w:t xml:space="preserve">Referencia API de la ficha, si corresponde.</w:t>
+            </w:r>
+          </w:p>
+        </w:tc>
+      </w:tr>
+      <w:tr>
+        <w:trPr/>
+        <w:tc>
+          <w:tcPr>
+            <w:tcW w:w="4500" w:type="dxa"/>
+            <w:noWrap/>
+          </w:tcPr>
+          <w:p>
+            <w:pPr/>
+            <w:r>
+              <w:rPr/>
+              <w:t xml:space="preserve">${PREFIX_fam_observaciones}</w:t>
+            </w:r>
+          </w:p>
+        </w:tc>
+        <w:tc>
+          <w:tcPr>
+            <w:tcW w:w="6500" w:type="dxa"/>
+            <w:noWrap/>
+          </w:tcPr>
+          <w:p>
+            <w:pPr/>
+            <w:r>
+              <w:rPr/>
+              <w:t xml:space="preserve">Observaciones del vinculo familiar.</w:t>
+            </w:r>
+          </w:p>
+        </w:tc>
+      </w:tr>
+    </w:tbl>
+    <w:p/>
+    <w:p>
+      <w:pPr>
+        <w:pStyle w:val="Heading3"/>
+      </w:pPr>
+      <w:bookmarkStart w:id="10" w:name="_Toc10"/>
+      <w:r>
+        <w:t>Abogado del familiar</w:t>
+      </w:r>
+      <w:bookmarkEnd w:id="10"/>
+    </w:p>
+    <w:tbl>
+      <w:tblGrid>
+        <w:gridCol w:w="4500" w:type="dxa"/>
+        <w:gridCol w:w="6500" w:type="dxa"/>
+      </w:tblGrid>
+      <w:tblPr>
+        <w:tblStyle w:val="Markers"/>
+      </w:tblPr>
+      <w:tr>
+        <w:trPr/>
+        <w:tc>
+          <w:tcPr>
+            <w:tcW w:w="4500" w:type="dxa"/>
+            <w:noWrap/>
+          </w:tcPr>
+          <w:p>
+            <w:pPr/>
+            <w:r>
+              <w:rPr>
+                <w:b w:val="1"/>
+                <w:bCs w:val="1"/>
+              </w:rPr>
+              <w:t xml:space="preserve">Marcador</w:t>
+            </w:r>
+          </w:p>
+        </w:tc>
+        <w:tc>
+          <w:tcPr>
+            <w:tcW w:w="6500" w:type="dxa"/>
+            <w:noWrap/>
+          </w:tcPr>
+          <w:p>
+            <w:pPr/>
+            <w:r>
+              <w:rPr>
+                <w:b w:val="1"/>
+                <w:bCs w:val="1"/>
+              </w:rPr>
+              <w:t xml:space="preserve">Contenido</w:t>
+            </w:r>
+          </w:p>
+        </w:tc>
+      </w:tr>
+      <w:tr>
+        <w:trPr/>
+        <w:tc>
+          <w:tcPr>
+            <w:tcW w:w="4500" w:type="dxa"/>
+            <w:noWrap/>
+          </w:tcPr>
+          <w:p>
+            <w:pPr/>
+            <w:r>
+              <w:rPr/>
               <w:t xml:space="preserve">${PREFIX_fam_abog_nombre}</w:t>
             </w:r>
           </w:p>
@@ -4411,7 +4928,7 @@
       </w:pPr>
       <w:r>
         <w:rPr/>
-        <w:t xml:space="preserve">Occiso: levantamiento ${occ_fecha_levantamiento} ${occ_hora_levantamiento}, protocolo ${occ_numero_protocolo}.</w:t>
+        <w:t xml:space="preserve">Occiso: levantamiento ${occ_fecha_levantamiento} ${occ_hora_levantamiento}, protocolo ${occ_numero_protocolo}. Dosaje: ${dosaje_resultado_cual} ${dosaje_resultado_cuant}.</w:t>
       </w:r>
     </w:p>
     <w:p>

</xml_diff>